<commit_message>
New comment thread doc
</commit_message>
<xml_diff>
--- a/test-files/Draft-NDA-Comment-Thread.docx
+++ b/test-files/Draft-NDA-Comment-Thread.docx
@@ -93,7 +93,43 @@
     </w:p>
     <w:p>
       <w:r>
-        <w:t>“Confidential Information” means any and all non-public information, whether in written, oral, electronic, or other form, disclosed by or on behalf of a Party (the “Disclosing Party”) to the other Party (the “Receiving Party”), including but not limited to: (a) trade secrets, inventions, ideas, processes, formulas, source and object code, data, programs, know-how, improvements, discoveries, developments, designs, and techniques; (b) information regarding plans for research, development, new products, marketing, and selling; (c) business plans, budgets, financial statements, contracts, prices, suppliers, and customers; (d) information regarding the skills and compensation of employees, contractors, and other agents; and (e) the existence and terms of this Agreement.</w:t>
+        <w:t xml:space="preserve">“Confidential Information” means any and all non-public information, whether in written, oral, electronic, or other form, disclosed by or on behalf of a Party (the “Disclosing Party”) to the other Party (the “Receiving Party”), including but not limited to: (a) </w:t>
+      </w:r>
+      <w:commentRangeStart w:id="3"/>
+      <w:commentRangeStart w:id="4"/>
+      <w:commentRangeStart w:id="5"/>
+      <w:r>
+        <w:t xml:space="preserve">trade secrets, inventions, ideas, processes, formulas, source and object code, data, programs, know-how, improvements, discoveries, developments, designs, and techniques; (b) information regarding plans </w:t>
+      </w:r>
+      <w:commentRangeEnd w:id="3"/>
+      <w:r>
+        <w:rPr>
+          <w:rStyle w:val="CommentReference"/>
+          <w:sz w:val="22"/>
+          <w:szCs w:val="22"/>
+        </w:rPr>
+        <w:commentReference w:id="3"/>
+      </w:r>
+      <w:commentRangeEnd w:id="4"/>
+      <w:r>
+        <w:rPr>
+          <w:rStyle w:val="CommentReference"/>
+          <w:sz w:val="22"/>
+          <w:szCs w:val="22"/>
+        </w:rPr>
+        <w:commentReference w:id="4"/>
+      </w:r>
+      <w:commentRangeEnd w:id="5"/>
+      <w:r>
+        <w:rPr>
+          <w:rStyle w:val="CommentReference"/>
+          <w:sz w:val="22"/>
+          <w:szCs w:val="22"/>
+        </w:rPr>
+        <w:commentReference w:id="5"/>
+      </w:r>
+      <w:r>
+        <w:t>for research, development, new products, marketing, and selling; (c) business plans, budgets, financial statements, contracts, prices, suppliers, and customers; (d) information regarding the skills and compensation of employees, contractors, and other agents; and (e) the existence and terms of this Agreement.</w:t>
       </w:r>
     </w:p>
     <w:p>
@@ -339,6 +375,57 @@
       </w:r>
     </w:p>
   </w:comment>
+  <w:comment w:id="3" w:author="Eric White" w:date="2026-07-01T02:52:00Z" w:initials="EW">
+    <w:p>
+      <w:r>
+        <w:rPr>
+          <w:rStyle w:val="CommentReference"/>
+        </w:rPr>
+        <w:annotationRef/>
+      </w:r>
+      <w:r>
+        <w:rPr>
+          <w:sz w:val="20"/>
+          <w:szCs w:val="20"/>
+        </w:rPr>
+        <w:t>First in thread</w:t>
+      </w:r>
+    </w:p>
+  </w:comment>
+  <w:comment w:id="4" w:author="Eric White" w:date="2026-07-01T02:52:00Z" w:initials="EW">
+    <w:p>
+      <w:r>
+        <w:rPr>
+          <w:rStyle w:val="CommentReference"/>
+        </w:rPr>
+        <w:annotationRef/>
+      </w:r>
+      <w:r>
+        <w:rPr>
+          <w:sz w:val="20"/>
+          <w:szCs w:val="20"/>
+        </w:rPr>
+        <w:t>Second in thread</w:t>
+      </w:r>
+    </w:p>
+  </w:comment>
+  <w:comment w:id="5" w:author="Eric White" w:date="2026-07-01T02:53:00Z" w:initials="EW">
+    <w:p>
+      <w:r>
+        <w:rPr>
+          <w:rStyle w:val="CommentReference"/>
+        </w:rPr>
+        <w:annotationRef/>
+      </w:r>
+      <w:r>
+        <w:rPr>
+          <w:sz w:val="20"/>
+          <w:szCs w:val="20"/>
+        </w:rPr>
+        <w:t>third in thread</w:t>
+      </w:r>
+    </w:p>
+  </w:comment>
 </w:comments>
 </file>
 
@@ -347,6 +434,9 @@
   <w15:commentEx w15:paraId="4BB97BC1" w15:done="0"/>
   <w15:commentEx w15:paraId="223EDA75" w15:paraIdParent="4BB97BC1" w15:done="0"/>
   <w15:commentEx w15:paraId="6B1F9870" w15:paraIdParent="4BB97BC1" w15:done="0"/>
+  <w15:commentEx w15:paraId="688FF03C" w15:done="0"/>
+  <w15:commentEx w15:paraId="4249352E" w15:paraIdParent="688FF03C" w15:done="0"/>
+  <w15:commentEx w15:paraId="5AC6AEB2" w15:paraIdParent="688FF03C" w15:done="0"/>
 </w15:commentsEx>
 </file>
 
@@ -355,6 +445,9 @@
   <w16cex:commentExtensible w16cex:durableId="6E5CA44F" w16cex:dateUtc="2026-06-30T22:00:00Z"/>
   <w16cex:commentExtensible w16cex:durableId="2A792423" w16cex:dateUtc="2026-06-30T22:00:00Z"/>
   <w16cex:commentExtensible w16cex:durableId="4AE25F36" w16cex:dateUtc="2026-06-30T22:00:00Z"/>
+  <w16cex:commentExtensible w16cex:durableId="5EE552A8" w16cex:dateUtc="2026-07-01T09:52:00Z"/>
+  <w16cex:commentExtensible w16cex:durableId="2B058831" w16cex:dateUtc="2026-07-01T09:52:00Z"/>
+  <w16cex:commentExtensible w16cex:durableId="4E2BD475" w16cex:dateUtc="2026-07-01T09:53:00Z"/>
 </w16cex:commentsExtensible>
 </file>
 
@@ -363,6 +456,9 @@
   <w16cid:commentId w16cid:paraId="4BB97BC1" w16cid:durableId="6E5CA44F"/>
   <w16cid:commentId w16cid:paraId="223EDA75" w16cid:durableId="2A792423"/>
   <w16cid:commentId w16cid:paraId="6B1F9870" w16cid:durableId="4AE25F36"/>
+  <w16cid:commentId w16cid:paraId="688FF03C" w16cid:durableId="5EE552A8"/>
+  <w16cid:commentId w16cid:paraId="4249352E" w16cid:durableId="2B058831"/>
+  <w16cid:commentId w16cid:paraId="5AC6AEB2" w16cid:durableId="4E2BD475"/>
 </w16cid:commentsIds>
 </file>
 

</xml_diff>